<commit_message>
Ameliore le manuel de fin de chantier : logo T3E, table des matieres, sous-titres numerotes, couleurs de marque, description de composition detaillee
</commit_message>
<xml_diff>
--- a/documents/manuel-template.docx
+++ b/documents/manuel-template.docx
@@ -4,12 +4,48 @@
   <w:body>
     <w:p>
       <w:pPr>
-        <w:pStyle w:val="Title"/>
-        <w:spacing w:after="600" w:before="1200"/>
+        <w:spacing w:after="400" w:before="600"/>
         <w:jc w:val="center"/>
       </w:pPr>
       <w:r>
-        <w:t xml:space="preserve">MANUEL DE FIN DE CHANTIER</w:t>
+        <w:drawing>
+          <wp:inline distT="0" distB="0" distL="0" distR="0">
+            <wp:extent cx="1047750" cy="1047750"/>
+            <wp:effectExtent t="0" r="0" b="0" l="0"/>
+            <wp:docPr id="1" name="" descr="" title=""/>
+            <wp:cNvGraphicFramePr>
+              <a:graphicFrameLocks xmlns:a="http://schemas.openxmlformats.org/drawingml/2006/main" noChangeAspect="1"/>
+            </wp:cNvGraphicFramePr>
+            <a:graphic xmlns:a="http://schemas.openxmlformats.org/drawingml/2006/main">
+              <a:graphicData uri="http://schemas.openxmlformats.org/drawingml/2006/picture">
+                <pic:pic xmlns:pic="http://schemas.openxmlformats.org/drawingml/2006/picture">
+                  <pic:nvPicPr>
+                    <pic:cNvPr id="0" name="" descr=""/>
+                    <pic:cNvPicPr>
+                      <a:picLocks noChangeAspect="1" noChangeArrowheads="1"/>
+                    </pic:cNvPicPr>
+                  </pic:nvPicPr>
+                  <pic:blipFill>
+                    <a:blip r:embed="rId7" cstate="none"/>
+                    <a:srcRect/>
+                    <a:stretch>
+                      <a:fillRect/>
+                    </a:stretch>
+                  </pic:blipFill>
+                  <pic:spPr bwMode="auto">
+                    <a:xfrm>
+                      <a:off x="0" y="0"/>
+                      <a:ext cx="1047750" cy="1047750"/>
+                    </a:xfrm>
+                    <a:prstGeom prst="rect">
+                      <a:avLst/>
+                    </a:prstGeom>
+                  </pic:spPr>
+                </pic:pic>
+              </a:graphicData>
+            </a:graphic>
+          </wp:inline>
+        </w:drawing>
       </w:r>
     </w:p>
     <w:p>
@@ -21,8 +57,25 @@
         <w:rPr>
           <w:b/>
           <w:bCs/>
-        </w:rPr>
-        <w:t xml:space="preserve">NOM DU PROJET :</w:t>
+          <w:color w:val="C8102E"/>
+          <w:sz w:val="44"/>
+          <w:szCs w:val="44"/>
+        </w:rPr>
+        <w:t xml:space="preserve">MANUEL DE FIN DE CHANTIER</w:t>
+      </w:r>
+    </w:p>
+    <w:p>
+      <w:pPr>
+        <w:spacing w:after="600"/>
+        <w:jc w:val="center"/>
+      </w:pPr>
+      <w:r>
+        <w:rPr>
+          <w:i/>
+          <w:iCs/>
+          <w:color w:val="6D6E71"/>
+        </w:rPr>
+        <w:t xml:space="preserve">Toitures Trois Étoiles Inc.</w:t>
       </w:r>
     </w:p>
     <w:p>
@@ -35,7 +88,7 @@
           <w:b/>
           <w:bCs/>
         </w:rPr>
-        <w:t xml:space="preserve">CLIENT :</w:t>
+        <w:t xml:space="preserve">NOM DU PROJET :</w:t>
       </w:r>
     </w:p>
     <w:p>
@@ -48,7 +101,7 @@
           <w:b/>
           <w:bCs/>
         </w:rPr>
-        <w:t xml:space="preserve">ADRESSE DU PROJET :</w:t>
+        <w:t xml:space="preserve">CLIENT :</w:t>
       </w:r>
     </w:p>
     <w:p>
@@ -61,7 +114,7 @@
           <w:b/>
           <w:bCs/>
         </w:rPr>
-        <w:t xml:space="preserve">NUMÉRO DE DOSSIER TTE :</w:t>
+        <w:t xml:space="preserve">ADRESSE DU PROJET :</w:t>
       </w:r>
     </w:p>
     <w:p>
@@ -74,20 +127,20 @@
           <w:b/>
           <w:bCs/>
         </w:rPr>
-        <w:t xml:space="preserve">DATE :</w:t>
-      </w:r>
-    </w:p>
-    <w:p>
-      <w:pPr>
-        <w:spacing w:before="800"/>
+        <w:t xml:space="preserve">NUMÉRO DE DOSSIER TTE :</w:t>
+      </w:r>
+    </w:p>
+    <w:p>
+      <w:pPr>
+        <w:spacing w:after="200"/>
         <w:jc w:val="center"/>
       </w:pPr>
       <w:r>
         <w:rPr>
-          <w:i/>
-          <w:iCs/>
-        </w:rPr>
-        <w:t xml:space="preserve">Toitures Trois Étoiles Inc.</w:t>
+          <w:b/>
+          <w:bCs/>
+        </w:rPr>
+        <w:t xml:space="preserve">DATE :</w:t>
       </w:r>
     </w:p>
     <w:p>
@@ -97,11 +150,154 @@
     </w:p>
     <w:p>
       <w:pPr>
-        <w:pStyle w:val="Heading1"/>
-        <w:spacing w:after="200" w:before="300"/>
-      </w:pPr>
-      <w:r>
-        <w:t xml:space="preserve">Liste des intervenants</w:t>
+        <w:pBdr>
+          <w:bottom w:val="single" w:color="C8102E" w:sz="8" w:space="4"/>
+        </w:pBdr>
+        <w:spacing w:after="300" w:before="200"/>
+      </w:pPr>
+      <w:r>
+        <w:rPr>
+          <w:b/>
+          <w:bCs/>
+          <w:color w:val="C8102E"/>
+          <w:sz w:val="30"/>
+          <w:szCs w:val="30"/>
+        </w:rPr>
+        <w:t xml:space="preserve">Table des matières</w:t>
+      </w:r>
+    </w:p>
+    <w:p>
+      <w:pPr>
+        <w:spacing w:after="160"/>
+      </w:pPr>
+      <w:r>
+        <w:t xml:space="preserve">1.  Liste des intervenants</w:t>
+      </w:r>
+    </w:p>
+    <w:p>
+      <w:pPr>
+        <w:spacing w:after="160"/>
+      </w:pPr>
+      <w:r>
+        <w:t xml:space="preserve">2.  Liste des fournisseurs et sous-traitants</w:t>
+      </w:r>
+    </w:p>
+    <w:p>
+      <w:pPr>
+        <w:spacing w:after="160"/>
+      </w:pPr>
+      <w:r>
+        <w:t xml:space="preserve">3.  Description des travaux exécutés</w:t>
+      </w:r>
+    </w:p>
+    <w:p>
+      <w:pPr>
+        <w:spacing w:after="160"/>
+      </w:pPr>
+      <w:r>
+        <w:t xml:space="preserve">4.  Détails et imprévus</w:t>
+      </w:r>
+    </w:p>
+    <w:p>
+      <w:pPr>
+        <w:spacing w:after="160"/>
+      </w:pPr>
+      <w:r>
+        <w:t xml:space="preserve">5.  Directives d'exploitation et d'entretien</w:t>
+      </w:r>
+    </w:p>
+    <w:p>
+      <w:pPr>
+        <w:spacing w:after="160"/>
+      </w:pPr>
+      <w:r>
+        <w:t xml:space="preserve">6.  Garanties</w:t>
+      </w:r>
+    </w:p>
+    <w:p>
+      <w:pPr>
+        <w:spacing w:after="160"/>
+      </w:pPr>
+      <w:r>
+        <w:t xml:space="preserve">7.  Manuel d'entretien préventif</w:t>
+      </w:r>
+    </w:p>
+    <w:p>
+      <w:pPr>
+        <w:spacing w:after="160"/>
+      </w:pPr>
+      <w:r>
+        <w:t xml:space="preserve">8.  Attestation de conformité CNESST</w:t>
+      </w:r>
+    </w:p>
+    <w:p>
+      <w:pPr>
+        <w:spacing w:after="160"/>
+      </w:pPr>
+      <w:r>
+        <w:t xml:space="preserve">9.  Attestation de conformité CCQ</w:t>
+      </w:r>
+    </w:p>
+    <w:p>
+      <w:pPr>
+        <w:spacing w:after="160"/>
+      </w:pPr>
+      <w:r>
+        <w:t xml:space="preserve">10.  Dessins d'atelier</w:t>
+      </w:r>
+    </w:p>
+    <w:p>
+      <w:pPr>
+        <w:spacing w:after="160"/>
+      </w:pPr>
+      <w:r>
+        <w:t xml:space="preserve">11.  Fiches techniques</w:t>
+      </w:r>
+    </w:p>
+    <w:p>
+      <w:pPr>
+        <w:spacing w:after="160"/>
+      </w:pPr>
+      <w:r>
+        <w:t xml:space="preserve">12.  Plans tels que construits (as-built)</w:t>
+      </w:r>
+    </w:p>
+    <w:p>
+      <w:r>
+        <w:br w:type="page"/>
+      </w:r>
+    </w:p>
+    <w:p>
+      <w:pPr>
+        <w:pBdr>
+          <w:bottom w:val="single" w:color="C8102E" w:sz="8" w:space="4"/>
+        </w:pBdr>
+        <w:spacing w:after="220" w:before="300"/>
+      </w:pPr>
+      <w:r>
+        <w:rPr>
+          <w:b/>
+          <w:bCs/>
+          <w:color w:val="C8102E"/>
+          <w:sz w:val="30"/>
+          <w:szCs w:val="30"/>
+        </w:rPr>
+        <w:t xml:space="preserve">1. Liste des intervenants</w:t>
+      </w:r>
+    </w:p>
+    <w:p>
+      <w:pPr>
+        <w:spacing w:after="150" w:before="200"/>
+      </w:pPr>
+      <w:r>
+        <w:rPr>
+          <w:b/>
+          <w:bCs/>
+          <w:color w:val="6D6E71"/>
+          <w:sz w:val="24"/>
+          <w:szCs w:val="24"/>
+        </w:rPr>
+        <w:t xml:space="preserve">Propriétaire</w:t>
       </w:r>
     </w:p>
     <w:p>
@@ -113,7 +309,22 @@
           <w:b/>
           <w:bCs/>
         </w:rPr>
-        <w:t xml:space="preserve">Propriétaire :</w:t>
+        <w:t xml:space="preserve">Propriétaire :</w:t>
+      </w:r>
+    </w:p>
+    <w:p>
+      <w:pPr>
+        <w:spacing w:after="150" w:before="200"/>
+      </w:pPr>
+      <w:r>
+        <w:rPr>
+          <w:b/>
+          <w:bCs/>
+          <w:color w:val="6D6E71"/>
+          <w:sz w:val="24"/>
+          <w:szCs w:val="24"/>
+        </w:rPr>
+        <w:t xml:space="preserve">Consultant</w:t>
       </w:r>
     </w:p>
     <w:p>
@@ -125,7 +336,22 @@
           <w:b/>
           <w:bCs/>
         </w:rPr>
-        <w:t xml:space="preserve">Consultant :</w:t>
+        <w:t xml:space="preserve">Consultant :</w:t>
+      </w:r>
+    </w:p>
+    <w:p>
+      <w:pPr>
+        <w:spacing w:after="150" w:before="200"/>
+      </w:pPr>
+      <w:r>
+        <w:rPr>
+          <w:b/>
+          <w:bCs/>
+          <w:color w:val="6D6E71"/>
+          <w:sz w:val="24"/>
+          <w:szCs w:val="24"/>
+        </w:rPr>
+        <w:t xml:space="preserve">Entrepreneur général</w:t>
       </w:r>
     </w:p>
     <w:p>
@@ -137,7 +363,22 @@
           <w:b/>
           <w:bCs/>
         </w:rPr>
-        <w:t xml:space="preserve">Entrepreneur général :</w:t>
+        <w:t xml:space="preserve">Entrepreneur général :</w:t>
+      </w:r>
+    </w:p>
+    <w:p>
+      <w:pPr>
+        <w:spacing w:after="150" w:before="200"/>
+      </w:pPr>
+      <w:r>
+        <w:rPr>
+          <w:b/>
+          <w:bCs/>
+          <w:color w:val="6D6E71"/>
+          <w:sz w:val="24"/>
+          <w:szCs w:val="24"/>
+        </w:rPr>
+        <w:t xml:space="preserve">Entrepreneur couvreur</w:t>
       </w:r>
     </w:p>
     <w:p>
@@ -149,7 +390,7 @@
           <w:b/>
           <w:bCs/>
         </w:rPr>
-        <w:t xml:space="preserve">Entrepreneur couvreur :</w:t>
+        <w:t xml:space="preserve">Entrepreneur couvreur :</w:t>
       </w:r>
     </w:p>
     <w:p>
@@ -159,20 +400,47 @@
     </w:p>
     <w:p>
       <w:pPr>
-        <w:pStyle w:val="Heading1"/>
-        <w:spacing w:after="200" w:before="300"/>
-      </w:pPr>
-      <w:r>
-        <w:t xml:space="preserve">Liste des fournisseurs et sous-traitants</w:t>
-      </w:r>
-    </w:p>
-    <w:p>
-      <w:pPr>
-        <w:pStyle w:val="Heading2"/>
+        <w:pBdr>
+          <w:bottom w:val="single" w:color="C8102E" w:sz="8" w:space="4"/>
+        </w:pBdr>
+        <w:spacing w:after="220" w:before="300"/>
+      </w:pPr>
+      <w:r>
+        <w:rPr>
+          <w:b/>
+          <w:bCs/>
+          <w:color w:val="C8102E"/>
+          <w:sz w:val="30"/>
+          <w:szCs w:val="30"/>
+        </w:rPr>
+        <w:t xml:space="preserve">2. Liste des fournisseurs et sous-traitants</w:t>
+      </w:r>
+    </w:p>
+    <w:p>
+      <w:pPr>
+        <w:spacing w:after="150" w:before="200"/>
+      </w:pPr>
+      <w:r>
+        <w:rPr>
+          <w:b/>
+          <w:bCs/>
+          <w:color w:val="6D6E71"/>
+          <w:sz w:val="24"/>
+          <w:szCs w:val="24"/>
+        </w:rPr>
+        <w:t xml:space="preserve">Fournisseurs</w:t>
+      </w:r>
+    </w:p>
+    <w:p>
+      <w:pPr>
         <w:spacing w:after="100" w:before="200"/>
       </w:pPr>
       <w:r>
-        <w:t xml:space="preserve">Fournisseurs</w:t>
+        <w:rPr>
+          <w:b/>
+          <w:bCs/>
+        </w:rPr>
+        <w:t xml:space="preserve">Fournisseur 1 :</w:t>
       </w:r>
     </w:p>
     <w:p>
@@ -184,7 +452,7 @@
           <w:b/>
           <w:bCs/>
         </w:rPr>
-        <w:t xml:space="preserve">Fournisseur 1 :</w:t>
+        <w:t xml:space="preserve">Fournisseur 2 :</w:t>
       </w:r>
     </w:p>
     <w:p>
@@ -196,7 +464,7 @@
           <w:b/>
           <w:bCs/>
         </w:rPr>
-        <w:t xml:space="preserve">Fournisseur 2 :</w:t>
+        <w:t xml:space="preserve">Fournisseur 3 :</w:t>
       </w:r>
     </w:p>
     <w:p>
@@ -208,7 +476,22 @@
           <w:b/>
           <w:bCs/>
         </w:rPr>
-        <w:t xml:space="preserve">Fournisseur 3 :</w:t>
+        <w:t xml:space="preserve">Fournisseur 4 :</w:t>
+      </w:r>
+    </w:p>
+    <w:p>
+      <w:pPr>
+        <w:spacing w:after="150" w:before="200"/>
+      </w:pPr>
+      <w:r>
+        <w:rPr>
+          <w:b/>
+          <w:bCs/>
+          <w:color w:val="6D6E71"/>
+          <w:sz w:val="24"/>
+          <w:szCs w:val="24"/>
+        </w:rPr>
+        <w:t xml:space="preserve">Sous-traitants</w:t>
       </w:r>
     </w:p>
     <w:p>
@@ -220,16 +503,7 @@
           <w:b/>
           <w:bCs/>
         </w:rPr>
-        <w:t xml:space="preserve">Fournisseur 4 :</w:t>
-      </w:r>
-    </w:p>
-    <w:p>
-      <w:pPr>
-        <w:pStyle w:val="Heading2"/>
-        <w:spacing w:after="100" w:before="300"/>
-      </w:pPr>
-      <w:r>
-        <w:t xml:space="preserve">Sous-traitants</w:t>
+        <w:t xml:space="preserve">Sous-traitant 1 :</w:t>
       </w:r>
     </w:p>
     <w:p>
@@ -241,7 +515,38 @@
           <w:b/>
           <w:bCs/>
         </w:rPr>
-        <w:t xml:space="preserve">Sous-traitant 1 :</w:t>
+        <w:t xml:space="preserve">Sous-traitant 2 :</w:t>
+      </w:r>
+    </w:p>
+    <w:p>
+      <w:r>
+        <w:br w:type="page"/>
+      </w:r>
+    </w:p>
+    <w:p>
+      <w:pPr>
+        <w:pBdr>
+          <w:bottom w:val="single" w:color="C8102E" w:sz="8" w:space="4"/>
+        </w:pBdr>
+        <w:spacing w:after="220" w:before="300"/>
+      </w:pPr>
+      <w:r>
+        <w:rPr>
+          <w:b/>
+          <w:bCs/>
+          <w:color w:val="C8102E"/>
+          <w:sz w:val="30"/>
+          <w:szCs w:val="30"/>
+        </w:rPr>
+        <w:t xml:space="preserve">3. Description des travaux exécutés</w:t>
+      </w:r>
+    </w:p>
+    <w:p>
+      <w:pPr>
+        <w:spacing w:after="200"/>
+      </w:pPr>
+      <w:r>
+        <w:t xml:space="preserve">Composition complète de la toiture installée, telle que décrite au devis (coupe-vapeur, isolant et épaisseur/pente, panneaux de support, membrane(s), relevés, solins, etc.) :</w:t>
       </w:r>
     </w:p>
     <w:p>
@@ -253,7 +558,7 @@
           <w:b/>
           <w:bCs/>
         </w:rPr>
-        <w:t xml:space="preserve">Sous-traitant 2 :</w:t>
+        <w:t xml:space="preserve">Description :</w:t>
       </w:r>
     </w:p>
     <w:p>
@@ -263,19 +568,28 @@
     </w:p>
     <w:p>
       <w:pPr>
-        <w:pStyle w:val="Heading1"/>
-        <w:spacing w:after="200" w:before="300"/>
-      </w:pPr>
-      <w:r>
-        <w:t xml:space="preserve">Description des travaux exécutés</w:t>
-      </w:r>
-    </w:p>
-    <w:p>
-      <w:pPr>
-        <w:spacing w:after="200"/>
-      </w:pPr>
-      <w:r>
-        <w:t xml:space="preserve">Composition complète de la toiture installée (coupe-vapeur, isolant, pente, panneaux de support, membrane, relevés, etc.) :</w:t>
+        <w:pBdr>
+          <w:bottom w:val="single" w:color="C8102E" w:sz="8" w:space="4"/>
+        </w:pBdr>
+        <w:spacing w:after="220" w:before="300"/>
+      </w:pPr>
+      <w:r>
+        <w:rPr>
+          <w:b/>
+          <w:bCs/>
+          <w:color w:val="C8102E"/>
+          <w:sz w:val="30"/>
+          <w:szCs w:val="30"/>
+        </w:rPr>
+        <w:t xml:space="preserve">4. Détails et imprévus</w:t>
+      </w:r>
+    </w:p>
+    <w:p>
+      <w:pPr>
+        <w:spacing w:after="150"/>
+      </w:pPr>
+      <w:r>
+        <w:t xml:space="preserve">Précisions, particularités ou événements imprévus survenus en cours de chantier, le cas échéant :</w:t>
       </w:r>
     </w:p>
     <w:p>
@@ -287,7 +601,7 @@
           <w:b/>
           <w:bCs/>
         </w:rPr>
-        <w:t xml:space="preserve">Description :</w:t>
+        <w:t xml:space="preserve">Détails :</w:t>
       </w:r>
     </w:p>
     <w:p>
@@ -297,11 +611,20 @@
     </w:p>
     <w:p>
       <w:pPr>
-        <w:pStyle w:val="Heading1"/>
-        <w:spacing w:after="200" w:before="300"/>
-      </w:pPr>
-      <w:r>
-        <w:t xml:space="preserve">Détails et imprévus</w:t>
+        <w:pBdr>
+          <w:bottom w:val="single" w:color="C8102E" w:sz="8" w:space="4"/>
+        </w:pBdr>
+        <w:spacing w:after="220" w:before="300"/>
+      </w:pPr>
+      <w:r>
+        <w:rPr>
+          <w:b/>
+          <w:bCs/>
+          <w:color w:val="C8102E"/>
+          <w:sz w:val="30"/>
+          <w:szCs w:val="30"/>
+        </w:rPr>
+        <w:t xml:space="preserve">5. Directives d'exploitation et d'entretien</w:t>
       </w:r>
     </w:p>
     <w:p>
@@ -309,33 +632,7 @@
         <w:spacing w:after="150"/>
       </w:pPr>
       <w:r>
-        <w:t xml:space="preserve">Précisions, particularités ou événements imprévus survenus en cours de chantier, le cas échéant :</w:t>
-      </w:r>
-    </w:p>
-    <w:p>
-      <w:pPr>
-        <w:spacing w:after="100" w:before="200"/>
-      </w:pPr>
-      <w:r>
-        <w:rPr>
-          <w:b/>
-          <w:bCs/>
-        </w:rPr>
-        <w:t xml:space="preserve">Détails :</w:t>
-      </w:r>
-    </w:p>
-    <w:p>
-      <w:r>
-        <w:br w:type="page"/>
-      </w:r>
-    </w:p>
-    <w:p>
-      <w:pPr>
-        <w:pStyle w:val="Heading1"/>
-        <w:spacing w:after="200" w:before="300"/>
-      </w:pPr>
-      <w:r>
-        <w:t xml:space="preserve">Directives d’exploitation et d’entretien</w:t>
+        <w:t xml:space="preserve">Les inspections préventives devraient être réalisées au moins deux fois par année, à l’automne et à la fin de l’hiver. Il est également recommandé de le faire à la suite d’événements climatiques majeurs (pluies abondantes, verglas, grands vents) ainsi qu’après toute installation ou tout travaux d’entretien d’appareils (climatisation, ventilation) sur la toiture.</w:t>
       </w:r>
     </w:p>
     <w:p>
@@ -343,23 +640,21 @@
         <w:spacing w:after="150"/>
       </w:pPr>
       <w:r>
-        <w:t xml:space="preserve">Les inspections préventives devraient être réalisées au moins deux fois par année, à l’automne et à la fin de l’hiver. Il est également recommandé de le faire à la suite d’événements climatiques majeurs (pluies abondantes, verglas, grands vents) ainsi qu’après toute installation ou tout travaux d’entretien d’appareils (climatisation, ventilation) sur la toiture.</w:t>
-      </w:r>
-    </w:p>
-    <w:p>
-      <w:pPr>
-        <w:spacing w:after="150"/>
-      </w:pPr>
-      <w:r>
         <w:t xml:space="preserve">Limitez l’accès au personnel autorisé uniquement. N’utilisez pas la toiture comme terrasse ou patio sans protection adéquate.</w:t>
       </w:r>
     </w:p>
     <w:p>
       <w:pPr>
-        <w:pStyle w:val="Heading2"/>
         <w:spacing w:after="150" w:before="300"/>
       </w:pPr>
       <w:r>
+        <w:rPr>
+          <w:b/>
+          <w:bCs/>
+          <w:color w:val="6D6E71"/>
+          <w:sz w:val="24"/>
+          <w:szCs w:val="24"/>
+        </w:rPr>
         <w:t xml:space="preserve">Liste de contrôle d’entretien</w:t>
       </w:r>
     </w:p>
@@ -387,6 +682,7 @@
         </w:trPr>
         <w:tc>
           <w:tcPr>
+            <w:shd w:fill="6D6E71"/>
             <w:tcMar>
               <w:top w:type="dxa" w:w="80"/>
               <w:left w:type="dxa" w:w="100"/>
@@ -400,6 +696,7 @@
               <w:rPr>
                 <w:b/>
                 <w:bCs/>
+                <w:color w:val="FFFFFF"/>
                 <w:sz w:val="18"/>
                 <w:szCs w:val="18"/>
               </w:rPr>
@@ -409,6 +706,7 @@
         </w:tc>
         <w:tc>
           <w:tcPr>
+            <w:shd w:fill="6D6E71"/>
             <w:tcMar>
               <w:top w:type="dxa" w:w="80"/>
               <w:left w:type="dxa" w:w="100"/>
@@ -422,6 +720,7 @@
               <w:rPr>
                 <w:b/>
                 <w:bCs/>
+                <w:color w:val="FFFFFF"/>
                 <w:sz w:val="18"/>
                 <w:szCs w:val="18"/>
               </w:rPr>
@@ -431,6 +730,7 @@
         </w:tc>
         <w:tc>
           <w:tcPr>
+            <w:shd w:fill="6D6E71"/>
             <w:tcMar>
               <w:top w:type="dxa" w:w="80"/>
               <w:left w:type="dxa" w:w="100"/>
@@ -444,6 +744,7 @@
               <w:rPr>
                 <w:b/>
                 <w:bCs/>
+                <w:color w:val="FFFFFF"/>
                 <w:sz w:val="18"/>
                 <w:szCs w:val="18"/>
               </w:rPr>
@@ -453,6 +754,7 @@
         </w:tc>
         <w:tc>
           <w:tcPr>
+            <w:shd w:fill="6D6E71"/>
             <w:tcMar>
               <w:top w:type="dxa" w:w="80"/>
               <w:left w:type="dxa" w:w="100"/>
@@ -466,6 +768,7 @@
               <w:rPr>
                 <w:b/>
                 <w:bCs/>
+                <w:color w:val="FFFFFF"/>
                 <w:sz w:val="18"/>
                 <w:szCs w:val="18"/>
               </w:rPr>
@@ -551,7 +854,7 @@
                 <w:sz w:val="16"/>
                 <w:szCs w:val="16"/>
               </w:rPr>
-              <w:t xml:space="preserve">Commentaire 1 :</w:t>
+              <w:t xml:space="preserve">Commentaire 1 :</w:t>
             </w:r>
           </w:p>
         </w:tc>
@@ -633,7 +936,7 @@
                 <w:sz w:val="16"/>
                 <w:szCs w:val="16"/>
               </w:rPr>
-              <w:t xml:space="preserve">Commentaire 2 :</w:t>
+              <w:t xml:space="preserve">Commentaire 2 :</w:t>
             </w:r>
           </w:p>
         </w:tc>
@@ -715,7 +1018,7 @@
                 <w:sz w:val="16"/>
                 <w:szCs w:val="16"/>
               </w:rPr>
-              <w:t xml:space="preserve">Commentaire 3 :</w:t>
+              <w:t xml:space="preserve">Commentaire 3 :</w:t>
             </w:r>
           </w:p>
         </w:tc>
@@ -797,7 +1100,7 @@
                 <w:sz w:val="16"/>
                 <w:szCs w:val="16"/>
               </w:rPr>
-              <w:t xml:space="preserve">Commentaire 4 :</w:t>
+              <w:t xml:space="preserve">Commentaire 4 :</w:t>
             </w:r>
           </w:p>
         </w:tc>
@@ -879,7 +1182,7 @@
                 <w:sz w:val="16"/>
                 <w:szCs w:val="16"/>
               </w:rPr>
-              <w:t xml:space="preserve">Commentaire 5 :</w:t>
+              <w:t xml:space="preserve">Commentaire 5 :</w:t>
             </w:r>
           </w:p>
         </w:tc>
@@ -961,7 +1264,7 @@
                 <w:sz w:val="16"/>
                 <w:szCs w:val="16"/>
               </w:rPr>
-              <w:t xml:space="preserve">Commentaire 6 :</w:t>
+              <w:t xml:space="preserve">Commentaire 6 :</w:t>
             </w:r>
           </w:p>
         </w:tc>
@@ -1043,7 +1346,7 @@
                 <w:sz w:val="16"/>
                 <w:szCs w:val="16"/>
               </w:rPr>
-              <w:t xml:space="preserve">Commentaire 7 :</w:t>
+              <w:t xml:space="preserve">Commentaire 7 :</w:t>
             </w:r>
           </w:p>
         </w:tc>
@@ -1125,7 +1428,7 @@
                 <w:sz w:val="16"/>
                 <w:szCs w:val="16"/>
               </w:rPr>
-              <w:t xml:space="preserve">Commentaire 8 :</w:t>
+              <w:t xml:space="preserve">Commentaire 8 :</w:t>
             </w:r>
           </w:p>
         </w:tc>
@@ -1207,7 +1510,7 @@
                 <w:sz w:val="16"/>
                 <w:szCs w:val="16"/>
               </w:rPr>
-              <w:t xml:space="preserve">Commentaire 9 :</w:t>
+              <w:t xml:space="preserve">Commentaire 9 :</w:t>
             </w:r>
           </w:p>
         </w:tc>
@@ -1220,19 +1523,34 @@
     </w:p>
     <w:p>
       <w:pPr>
-        <w:pStyle w:val="Heading1"/>
-        <w:spacing w:after="200" w:before="300"/>
-      </w:pPr>
-      <w:r>
-        <w:t xml:space="preserve">Garanties</w:t>
-      </w:r>
-    </w:p>
-    <w:p>
-      <w:pPr>
-        <w:pStyle w:val="Heading2"/>
+        <w:pBdr>
+          <w:bottom w:val="single" w:color="C8102E" w:sz="8" w:space="4"/>
+        </w:pBdr>
+        <w:spacing w:after="220" w:before="300"/>
+      </w:pPr>
+      <w:r>
+        <w:rPr>
+          <w:b/>
+          <w:bCs/>
+          <w:color w:val="C8102E"/>
+          <w:sz w:val="30"/>
+          <w:szCs w:val="30"/>
+        </w:rPr>
+        <w:t xml:space="preserve">6. Garanties</w:t>
+      </w:r>
+    </w:p>
+    <w:p>
+      <w:pPr>
         <w:spacing w:after="150" w:before="200"/>
       </w:pPr>
       <w:r>
+        <w:rPr>
+          <w:b/>
+          <w:bCs/>
+          <w:color w:val="6D6E71"/>
+          <w:sz w:val="24"/>
+          <w:szCs w:val="24"/>
+        </w:rPr>
         <w:t xml:space="preserve">Certificat de garantie — Toitures Trois Étoiles Inc.</w:t>
       </w:r>
     </w:p>
@@ -1245,7 +1563,7 @@
           <w:b/>
           <w:bCs/>
         </w:rPr>
-        <w:t xml:space="preserve">Numéro de garantie :</w:t>
+        <w:t xml:space="preserve">Numéro de garantie :</w:t>
       </w:r>
     </w:p>
     <w:p>
@@ -1257,7 +1575,7 @@
           <w:b/>
           <w:bCs/>
         </w:rPr>
-        <w:t xml:space="preserve">Surface garantie :</w:t>
+        <w:t xml:space="preserve">Surface garantie :</w:t>
       </w:r>
     </w:p>
     <w:p>
@@ -1269,7 +1587,7 @@
           <w:b/>
           <w:bCs/>
         </w:rPr>
-        <w:t xml:space="preserve">Durée de la garantie :</w:t>
+        <w:t xml:space="preserve">Durée de la garantie :</w:t>
       </w:r>
     </w:p>
     <w:p>
@@ -1281,7 +1599,7 @@
           <w:b/>
           <w:bCs/>
         </w:rPr>
-        <w:t xml:space="preserve">Date de fin de garantie :</w:t>
+        <w:t xml:space="preserve">Date de fin de garantie :</w:t>
       </w:r>
     </w:p>
     <w:p>
@@ -1502,7 +1820,13 @@
 <file path=word/styles.xml><?xml version="1.0" encoding="utf-8"?>
 <w:styles xmlns:mc="http://schemas.openxmlformats.org/markup-compatibility/2006" xmlns:r="http://schemas.openxmlformats.org/officeDocument/2006/relationships" xmlns:w="http://schemas.openxmlformats.org/wordprocessingml/2006/main" xmlns:w14="http://schemas.microsoft.com/office/word/2010/wordml" xmlns:w15="http://schemas.microsoft.com/office/word/2012/wordml" mc:Ignorable="w14 w15">
   <w:docDefaults>
-    <w:rPrDefault/>
+    <w:rPrDefault>
+      <w:rPr>
+        <w:rFonts w:ascii="Calibri" w:cs="Calibri" w:eastAsia="Calibri" w:hAnsi="Calibri"/>
+        <w:sz w:val="22"/>
+        <w:szCs w:val="22"/>
+      </w:rPr>
+    </w:rPrDefault>
     <w:pPrDefault/>
   </w:docDefaults>
   <w:style w:type="paragraph" w:styleId="Title">

</xml_diff>